<commit_message>
Pemberian Fungsional Face Detection dengan DOCX dan Helper
</commit_message>
<xml_diff>
--- a/docs/FACEDETECTION_Panduan_Fungsional.docx
+++ b/docs/FACEDETECTION_Panduan_Fungsional.docx
@@ -81,7 +81,23 @@
         <w:pStyle w:val="ListBullet"/>
       </w:pPr>
       <w:r>
-        <w:t>Gunakan akun Odoo yang aktif dan terhubung dengan data karyawan.</w:t>
+        <w:t>User wajib memiliki akun/user Odoo yang aktif.</w:t>
+      </w:r>
+    </w:p>
+    <w:p>
+      <w:pPr>
+        <w:pStyle w:val="ListBullet"/>
+      </w:pPr>
+      <w:r>
+        <w:t>Akun Odoo wajib terhubung dengan data employee/karyawan di Odoo.</w:t>
+      </w:r>
+    </w:p>
+    <w:p>
+      <w:pPr>
+        <w:pStyle w:val="ListBullet"/>
+      </w:pPr>
+      <w:r>
+        <w:t>Foto wajah wajib di-upload/daftarkan terlebih dahulu melalui menu Wajah sebelum presensi.</w:t>
       </w:r>
     </w:p>
     <w:p>
@@ -166,12 +182,12 @@
         <w:pStyle w:val="Heading1"/>
       </w:pPr>
       <w:r>
-        <w:t>4. Pendaftaran Wajah</w:t>
+        <w:t>4. Upload dan Pendaftaran Wajah</w:t>
       </w:r>
     </w:p>
     <w:p>
       <w:r>
-        <w:t>Pendaftaran wajah dilakukan satu kali atau diulang apabila wajah berubah secara signifikan.</w:t>
+        <w:t>Upload/pendaftaran foto wajah adalah prasyarat wajib. User tidak dapat melakukan presensi sebelum proses ini selesai dan status wajah aktif.</w:t>
       </w:r>
     </w:p>
     <w:p>

</xml_diff>